<commit_message>
Part 4: Figure 4-4에 712추가기록 p.14 RUN_ID=4 실제 크롭 삽입
- BATCH_RUN_LOG 실행 이력에서 헤더+RUN_ID=4 행만 크롭(OPTIMIZED/100000/
  90002011~90102010/57.00/DONE)하여 Figure 4-4로 삽입
- NAIVE·ERROR·PARTIAL 행은 Part 5 범위이므로 크롭에서 제외
- 실화면 3개(컴파일오류·객체 VALID·RUN_ID=4), placeholder 4개로 축소
</commit_message>
<xml_diff>
--- a/report/PART4_재구성본.docx
+++ b/report/PART4_재구성본.docx
@@ -2154,15 +2154,40 @@
     <w:p>
       <w:pPr>
         <w:jc w:val="center"/>
-        <w:shd w:val="clear" w:fill="FBEAE7"/>
-      </w:pPr>
-      <w:r>
-        <w:rPr>
-          <w:i/>
-          <w:color w:val="B03A2E"/>
-          <w:sz w:val="20"/>
-        </w:rPr>
-        <w:t>［ 712추가기록 p.14 RUN_ID=4 행 크롭 — OPTIMIZED / TARGET_CNT 100000 / START 90002011 / END 90102010 / STATUS DONE ］</w:t>
+      </w:pPr>
+      <w:r>
+        <w:drawing>
+          <wp:inline xmlns:a="http://schemas.openxmlformats.org/drawingml/2006/main" xmlns:pic="http://schemas.openxmlformats.org/drawingml/2006/picture">
+            <wp:extent cx="5760720" cy="207026"/>
+            <wp:docPr id="3" name="Picture 3"/>
+            <wp:cNvGraphicFramePr>
+              <a:graphicFrameLocks noChangeAspect="1"/>
+            </wp:cNvGraphicFramePr>
+            <a:graphic>
+              <a:graphicData uri="http://schemas.openxmlformats.org/drawingml/2006/picture">
+                <pic:pic>
+                  <pic:nvPicPr>
+                    <pic:cNvPr id="0" name="fig44.png"/>
+                    <pic:cNvPicPr/>
+                  </pic:nvPicPr>
+                  <pic:blipFill>
+                    <a:blip r:embed="rId12"/>
+                    <a:stretch>
+                      <a:fillRect/>
+                    </a:stretch>
+                  </pic:blipFill>
+                  <pic:spPr>
+                    <a:xfrm>
+                      <a:off x="0" y="0"/>
+                      <a:ext cx="5760720" cy="207026"/>
+                    </a:xfrm>
+                    <a:prstGeom prst="rect"/>
+                  </pic:spPr>
+                </pic:pic>
+              </a:graphicData>
+            </a:graphic>
+          </wp:inline>
+        </w:drawing>
       </w:r>
     </w:p>
     <w:p>

</xml_diff>